<commit_message>
Update project build log with repository setup evidence
Documented repository setup, documentation decisions, GitHub workflow and evidence captured during the project foundation stage.
</commit_message>
<xml_diff>
--- a/06_docs/Project_1_Build_Log.docx
+++ b/06_docs/Project_1_Build_Log.docx
@@ -1450,12 +1450,6 @@
             <w:tcW w:w="9016" w:type="dxa"/>
           </w:tcPr>
           <w:p>
-            <w:pPr>
-              <w:rPr>
-                <w:b/>
-                <w:bCs/>
-              </w:rPr>
-            </w:pPr>
             <w:r>
               <w:rPr>
                 <w:b/>
@@ -1464,6 +1458,16 @@
               <w:t>Date:</w:t>
             </w:r>
             <w:r>
+              <w:rPr>
+                <w:b/>
+                <w:bCs/>
+              </w:rPr>
+              <w:t xml:space="preserve"> </w:t>
+            </w:r>
+            <w:r>
+              <w:t>06/07/2026</w:t>
+            </w:r>
+            <w:r>
               <w:br/>
             </w:r>
             <w:r>
@@ -1474,6 +1478,16 @@
               <w:t>Tool used:</w:t>
             </w:r>
             <w:r>
+              <w:rPr>
+                <w:b/>
+                <w:bCs/>
+              </w:rPr>
+              <w:t xml:space="preserve"> </w:t>
+            </w:r>
+            <w:r>
+              <w:t>GitHub Desktop</w:t>
+            </w:r>
+            <w:r>
               <w:br/>
             </w:r>
             <w:r>
@@ -1484,6 +1498,35 @@
               <w:t>What I did:</w:t>
             </w:r>
             <w:r>
+              <w:rPr>
+                <w:b/>
+                <w:bCs/>
+              </w:rPr>
+              <w:t xml:space="preserve"> </w:t>
+            </w:r>
+            <w:r>
+              <w:t>Committed</w:t>
+            </w:r>
+            <w:r>
+              <w:t xml:space="preserve"> and pushed the initial project structure, README, documentation tem</w:t>
+            </w:r>
+            <w:r>
+              <w:t xml:space="preserve">plates, screenshots </w:t>
+            </w:r>
+            <w:proofErr w:type="gramStart"/>
+            <w:r>
+              <w:t>and .</w:t>
+            </w:r>
+            <w:proofErr w:type="spellStart"/>
+            <w:r>
+              <w:t>gitignore</w:t>
+            </w:r>
+            <w:proofErr w:type="spellEnd"/>
+            <w:proofErr w:type="gramEnd"/>
+            <w:r>
+              <w:t xml:space="preserve"> rule to GitHub.</w:t>
+            </w:r>
+            <w:r>
               <w:br/>
             </w:r>
             <w:r>
@@ -1494,6 +1537,31 @@
               <w:t>Why it matters:</w:t>
             </w:r>
             <w:r>
+              <w:rPr>
+                <w:b/>
+                <w:bCs/>
+              </w:rPr>
+              <w:t xml:space="preserve"> </w:t>
+            </w:r>
+            <w:r>
+              <w:t xml:space="preserve">The </w:t>
+            </w:r>
+            <w:proofErr w:type="spellStart"/>
+            <w:r>
+              <w:t>repsoirtory</w:t>
+            </w:r>
+            <w:proofErr w:type="spellEnd"/>
+            <w:r>
+              <w:t xml:space="preserve"> now has a visible, version-controlled starting point </w:t>
+            </w:r>
+            <w:r>
+              <w:lastRenderedPageBreak/>
+              <w:t xml:space="preserve">before the technical </w:t>
+            </w:r>
+            <w:r>
+              <w:t>analysis begins.</w:t>
+            </w:r>
+            <w:r>
               <w:br/>
             </w:r>
             <w:r>
@@ -1504,6 +1572,25 @@
               <w:t>Problem or decision:</w:t>
             </w:r>
             <w:r>
+              <w:rPr>
+                <w:b/>
+                <w:bCs/>
+              </w:rPr>
+              <w:t xml:space="preserve"> </w:t>
+            </w:r>
+            <w:r>
+              <w:t>Raw data, long recordings and build evidence files are intentionally retained locally</w:t>
+            </w:r>
+            <w:r>
+              <w:t xml:space="preserve"> and excluded from the public repositor</w:t>
+            </w:r>
+            <w:r>
+              <w:t>y</w:t>
+            </w:r>
+            <w:r>
+              <w:t xml:space="preserve"> </w:t>
+            </w:r>
+            <w:r>
               <w:br/>
             </w:r>
             <w:r>
@@ -1511,13 +1598,30 @@
                 <w:b/>
                 <w:bCs/>
               </w:rPr>
-              <w:lastRenderedPageBreak/>
               <w:t>What I learned:</w:t>
             </w:r>
             <w:r>
               <w:t xml:space="preserve">  </w:t>
             </w:r>
             <w:r>
+              <w:t xml:space="preserve">A </w:t>
+            </w:r>
+            <w:r>
+              <w:t>c</w:t>
+            </w:r>
+            <w:r>
+              <w:t>om</w:t>
+            </w:r>
+            <w:r>
+              <w:t>m</w:t>
+            </w:r>
+            <w:r>
+              <w:t>it records a snapshot lo</w:t>
+            </w:r>
+            <w:r>
+              <w:t>cally; Push origin publishes that snapshot to GitHub.</w:t>
+            </w:r>
+            <w:r>
               <w:br/>
             </w:r>
             <w:r>
@@ -1527,8 +1631,66 @@
               </w:rPr>
               <w:t xml:space="preserve">Evidence saved: </w:t>
             </w:r>
-            <w:r>
-              <w:t>Screenshot / video / file name</w:t>
+          </w:p>
+          <w:p>
+            <w:pPr>
+              <w:rPr>
+                <w:b/>
+                <w:bCs/>
+              </w:rPr>
+            </w:pPr>
+            <w:r>
+              <w:rPr>
+                <w:noProof/>
+              </w:rPr>
+              <w:drawing>
+                <wp:inline distT="0" distB="0" distL="0" distR="0" wp14:anchorId="49587543" wp14:editId="4F9F656D">
+                  <wp:extent cx="1165442" cy="655529"/>
+                  <wp:effectExtent l="0" t="0" r="0" b="0"/>
+                  <wp:docPr id="1281397105" name="Picture 6"/>
+                  <wp:cNvGraphicFramePr>
+                    <a:graphicFrameLocks xmlns:a="http://schemas.openxmlformats.org/drawingml/2006/main" noChangeAspect="1"/>
+                  </wp:cNvGraphicFramePr>
+                  <a:graphic xmlns:a="http://schemas.openxmlformats.org/drawingml/2006/main">
+                    <a:graphicData uri="http://schemas.openxmlformats.org/drawingml/2006/picture">
+                      <pic:pic xmlns:pic="http://schemas.openxmlformats.org/drawingml/2006/picture">
+                        <pic:nvPicPr>
+                          <pic:cNvPr id="0" name="Picture 10"/>
+                          <pic:cNvPicPr>
+                            <a:picLocks noChangeAspect="1" noChangeArrowheads="1"/>
+                          </pic:cNvPicPr>
+                        </pic:nvPicPr>
+                        <pic:blipFill>
+                          <a:blip r:embed="rId10" cstate="print">
+                            <a:extLst>
+                              <a:ext uri="{28A0092B-C50C-407E-A947-70E740481C1C}">
+                                <a14:useLocalDpi xmlns:a14="http://schemas.microsoft.com/office/drawing/2010/main" val="0"/>
+                              </a:ext>
+                            </a:extLst>
+                          </a:blip>
+                          <a:srcRect/>
+                          <a:stretch>
+                            <a:fillRect/>
+                          </a:stretch>
+                        </pic:blipFill>
+                        <pic:spPr bwMode="auto">
+                          <a:xfrm>
+                            <a:off x="0" y="0"/>
+                            <a:ext cx="1179351" cy="663352"/>
+                          </a:xfrm>
+                          <a:prstGeom prst="rect">
+                            <a:avLst/>
+                          </a:prstGeom>
+                          <a:noFill/>
+                          <a:ln>
+                            <a:noFill/>
+                          </a:ln>
+                        </pic:spPr>
+                      </pic:pic>
+                    </a:graphicData>
+                  </a:graphic>
+                </wp:inline>
+              </w:drawing>
             </w:r>
           </w:p>
           <w:p>

</xml_diff>